<commit_message>
Add a SpaceXAI job application demo and a demo form picker
- "Demo forms" (banner and home) now opens /demo, which offers the
  T-Mobile signup or the new SpaceXAI application
- /spacexai: a Software Engineer application (about you, education,
  experience) plus two 50-word short answers, with live word counts
- Forms can now have textarea fields with maxWords and a business
  context. Formly drafts those answers in the user's voice from their
  twin, in parallel with the regular fill, using Gemini Flash
- Drafts must quote their evidence from the twin first. An answer is
  dropped if no quote matches or it uses a number the twin lacks, so
  thin data gives a blank answer instead of a made-up story
- The twin now keeps resume detail (projects, numbers, GPA, skills,
  citizenship), and the fill knows today's date for age and years
- Richer resume for Alex Chen, new resumes for Jamal Washington and
  Aisha Bello

Co-Authored-By: Claude Opus 5.5 <noreply@anthropic.com>
</commit_message>
<xml_diff>
--- a/sample-data/alex-chen/resume.docx
+++ b/sample-data/alex-chen/resume.docx
@@ -1,107 +1,381 @@
 
 <file path=word/document.xml><?xml version="1.0" encoding="utf-8"?>
-<w:document xmlns:ve="http://schemas.openxmlformats.org/markup-compatibility/2006" xmlns:o="urn:schemas-microsoft-com:office:office" xmlns:r="http://schemas.openxmlformats.org/officeDocument/2006/relationships" xmlns:v="urn:schemas-microsoft-com:vml" xmlns:wp="http://schemas.openxmlformats.org/drawingml/2006/wordprocessingDrawing" xmlns:w10="urn:schemas-microsoft-com:office:word" xmlns:w="http://schemas.openxmlformats.org/wordprocessingml/2006/main">
+<w:document xmlns:r="http://schemas.openxmlformats.org/officeDocument/2006/relationships" xmlns:w="http://schemas.openxmlformats.org/wordprocessingml/2006/main">
   <w:body>
     <w:p>
-      <w:pPr/>
-      <w:r>
-        <w:rPr>
-          <w:rFonts w:ascii="Helvetica Light" w:hAnsi="Helvetica Light" w:cs="Helvetica Light"/>
-          <w:sz w:val="24"/>
-          <w:sz-cs w:val="24"/>
+      <w:pPr>
+        <w:spacing w:before="0" w:after="40"/>
+      </w:pPr>
+      <w:r>
+        <w:rPr>
+          <w:rFonts w:ascii="Helvetica Light" w:hAnsi="Helvetica Light" w:cs="Helvetica Light"/>
+          <w:b/>
+          <w:sz w:val="32"/>
+          <w:szCs w:val="32"/>
         </w:rPr>
         <w:t xml:space="preserve">Alex Chen</w:t>
       </w:r>
     </w:p>
     <w:p>
-      <w:pPr/>
-      <w:r>
-        <w:rPr>
-          <w:rFonts w:ascii="Helvetica Light" w:hAnsi="Helvetica Light" w:cs="Helvetica Light"/>
-          <w:sz w:val="24"/>
-          <w:sz-cs w:val="24"/>
-        </w:rPr>
-        <w:t xml:space="preserve">Seattle, WA · alex.chen.dev@gmail.com · (206) 555-0147</w:t>
-      </w:r>
-    </w:p>
-    <w:p>
-      <w:pPr/>
-      <w:r>
-        <w:rPr>
-          <w:rFonts w:ascii="Helvetica Light" w:hAnsi="Helvetica Light" w:cs="Helvetica Light"/>
-          <w:sz w:val="24"/>
-          <w:sz-cs w:val="24"/>
+      <w:pPr>
+        <w:spacing w:before="0" w:after="40"/>
+      </w:pPr>
+      <w:r>
+        <w:rPr>
+          <w:rFonts w:ascii="Helvetica Light" w:hAnsi="Helvetica Light" w:cs="Helvetica Light"/>
+          <w:sz w:val="22"/>
+          <w:szCs w:val="22"/>
+        </w:rPr>
+        <w:t xml:space="preserve">Seattle, WA · alex.chen.dev@gmail.com · (206) 555-0147 · U.S. citizen</w:t>
+      </w:r>
+    </w:p>
+    <w:p>
+      <w:pPr>
+        <w:spacing w:before="0" w:after="40"/>
+      </w:pPr>
+      <w:r>
+        <w:rPr>
+          <w:rFonts w:ascii="Helvetica Light" w:hAnsi="Helvetica Light" w:cs="Helvetica Light"/>
+          <w:sz w:val="22"/>
+          <w:szCs w:val="22"/>
         </w:rPr>
         <w:t xml:space="preserve"/>
       </w:r>
     </w:p>
     <w:p>
-      <w:pPr/>
-      <w:r>
-        <w:rPr>
-          <w:rFonts w:ascii="Helvetica Light" w:hAnsi="Helvetica Light" w:cs="Helvetica Light"/>
-          <w:sz w:val="24"/>
-          <w:sz-cs w:val="24"/>
+      <w:pPr>
+        <w:spacing w:before="240" w:after="40"/>
+      </w:pPr>
+      <w:r>
+        <w:rPr>
+          <w:rFonts w:ascii="Helvetica Light" w:hAnsi="Helvetica Light" w:cs="Helvetica Light"/>
+          <w:b/>
+          <w:sz w:val="22"/>
+          <w:szCs w:val="22"/>
         </w:rPr>
         <w:t xml:space="preserve">EXPERIENCE</w:t>
       </w:r>
     </w:p>
     <w:p>
-      <w:pPr/>
-      <w:r>
-        <w:rPr>
-          <w:rFonts w:ascii="Helvetica Light" w:hAnsi="Helvetica Light" w:cs="Helvetica Light"/>
-          <w:sz w:val="24"/>
-          <w:sz-cs w:val="24"/>
+      <w:pPr>
+        <w:spacing w:before="120" w:after="40"/>
+      </w:pPr>
+      <w:r>
+        <w:rPr>
+          <w:rFonts w:ascii="Helvetica Light" w:hAnsi="Helvetica Light" w:cs="Helvetica Light"/>
+          <w:b/>
+          <w:sz w:val="22"/>
+          <w:szCs w:val="22"/>
         </w:rPr>
         <w:t xml:space="preserve">Northwind Robotics — Software Engineer II (Aug 2021 – present)</w:t>
       </w:r>
     </w:p>
     <w:p>
-      <w:pPr/>
-      <w:r>
-        <w:rPr>
-          <w:rFonts w:ascii="Helvetica Light" w:hAnsi="Helvetica Light" w:cs="Helvetica Light"/>
-          <w:sz w:val="24"/>
-          <w:sz-cs w:val="24"/>
-        </w:rPr>
-        <w:t xml:space="preserve">  Built fleet telemetry pipelines in Rust and TypeScript.</w:t>
-      </w:r>
-    </w:p>
-    <w:p>
-      <w:pPr/>
-      <w:r>
-        <w:rPr>
-          <w:rFonts w:ascii="Helvetica Light" w:hAnsi="Helvetica Light" w:cs="Helvetica Light"/>
-          <w:sz w:val="24"/>
-          <w:sz-cs w:val="24"/>
+      <w:pPr>
+        <w:spacing w:before="0" w:after="40"/>
+        <w:ind w:left="360"/>
+      </w:pPr>
+      <w:r>
+        <w:rPr>
+          <w:rFonts w:ascii="Helvetica Light" w:hAnsi="Helvetica Light" w:cs="Helvetica Light"/>
+          <w:sz w:val="22"/>
+          <w:szCs w:val="22"/>
+        </w:rPr>
+        <w:t xml:space="preserve">• Built fleet telemetry pipelines in Rust and TypeScript for 1,200 warehouse robots across 9 sites.</w:t>
+      </w:r>
+    </w:p>
+    <w:p>
+      <w:pPr>
+        <w:spacing w:before="0" w:after="40"/>
+        <w:ind w:left="360"/>
+      </w:pPr>
+      <w:r>
+        <w:rPr>
+          <w:rFonts w:ascii="Helvetica Light" w:hAnsi="Helvetica Light" w:cs="Helvetica Light"/>
+          <w:sz w:val="22"/>
+          <w:szCs w:val="22"/>
+        </w:rPr>
+        <w:t xml:space="preserve">• Rewrote the ingest service from Node to Rust: p99 latency went from 4.1 s to 280 ms and cloud spend dropped 38%.</w:t>
+      </w:r>
+    </w:p>
+    <w:p>
+      <w:pPr>
+        <w:spacing w:before="0" w:after="40"/>
+        <w:ind w:left="360"/>
+      </w:pPr>
+      <w:r>
+        <w:rPr>
+          <w:rFonts w:ascii="Helvetica Light" w:hAnsi="Helvetica Light" w:cs="Helvetica Light"/>
+          <w:sz w:val="22"/>
+          <w:szCs w:val="22"/>
+        </w:rPr>
+        <w:t xml:space="preserve">• Found a clock-drift bug that was silently corrupting about 2% of sensor logs fleet-wide. Added PTP time sync on the robots and a replay harness so it can't regress.</w:t>
+      </w:r>
+    </w:p>
+    <w:p>
+      <w:pPr>
+        <w:spacing w:before="0" w:after="40"/>
+        <w:ind w:left="360"/>
+      </w:pPr>
+      <w:r>
+        <w:rPr>
+          <w:rFonts w:ascii="Helvetica Light" w:hAnsi="Helvetica Light" w:cs="Helvetica Light"/>
+          <w:sz w:val="22"/>
+          <w:szCs w:val="22"/>
+        </w:rPr>
+        <w:t xml:space="preserve">• Built the anomaly detector that flags failing drive motors from vibration data (PyTorch); it catches about 70% of failures a day early.</w:t>
+      </w:r>
+    </w:p>
+    <w:p>
+      <w:pPr>
+        <w:spacing w:before="0" w:after="40"/>
+        <w:ind w:left="360"/>
+      </w:pPr>
+      <w:r>
+        <w:rPr>
+          <w:rFonts w:ascii="Helvetica Light" w:hAnsi="Helvetica Light" w:cs="Helvetica Light"/>
+          <w:sz w:val="22"/>
+          <w:szCs w:val="22"/>
+        </w:rPr>
+        <w:t xml:space="preserve">• Run on-call rotation for the telemetry platform (6 engineers).</w:t>
+      </w:r>
+    </w:p>
+    <w:p>
+      <w:pPr>
+        <w:spacing w:before="120" w:after="40"/>
+      </w:pPr>
+      <w:r>
+        <w:rPr>
+          <w:rFonts w:ascii="Helvetica Light" w:hAnsi="Helvetica Light" w:cs="Helvetica Light"/>
+          <w:b/>
+          <w:sz w:val="22"/>
+          <w:szCs w:val="22"/>
+        </w:rPr>
+        <w:t xml:space="preserve">Cascade Avionics — Software Engineering Intern (Jun – Sep 2020)</w:t>
+      </w:r>
+    </w:p>
+    <w:p>
+      <w:pPr>
+        <w:spacing w:before="0" w:after="40"/>
+        <w:ind w:left="360"/>
+      </w:pPr>
+      <w:r>
+        <w:rPr>
+          <w:rFonts w:ascii="Helvetica Light" w:hAnsi="Helvetica Light" w:cs="Helvetica Light"/>
+          <w:sz w:val="22"/>
+          <w:szCs w:val="22"/>
+        </w:rPr>
+        <w:t xml:space="preserve">• Wrote Python tools to parse ARINC 429 flight-test bus captures and flag out-of-range readings for test engineers.</w:t>
+      </w:r>
+    </w:p>
+    <w:p>
+      <w:pPr>
+        <w:spacing w:before="0" w:after="40"/>
+      </w:pPr>
+      <w:r>
+        <w:rPr>
+          <w:rFonts w:ascii="Helvetica Light" w:hAnsi="Helvetica Light" w:cs="Helvetica Light"/>
+          <w:sz w:val="22"/>
+          <w:szCs w:val="22"/>
         </w:rPr>
         <w:t xml:space="preserve"/>
       </w:r>
     </w:p>
     <w:p>
-      <w:pPr/>
-      <w:r>
-        <w:rPr>
-          <w:rFonts w:ascii="Helvetica Light" w:hAnsi="Helvetica Light" w:cs="Helvetica Light"/>
-          <w:sz w:val="24"/>
-          <w:sz-cs w:val="24"/>
+      <w:pPr>
+        <w:spacing w:before="240" w:after="40"/>
+      </w:pPr>
+      <w:r>
+        <w:rPr>
+          <w:rFonts w:ascii="Helvetica Light" w:hAnsi="Helvetica Light" w:cs="Helvetica Light"/>
+          <w:b/>
+          <w:sz w:val="22"/>
+          <w:szCs w:val="22"/>
         </w:rPr>
         <w:t xml:space="preserve">EDUCATION</w:t>
       </w:r>
     </w:p>
     <w:p>
-      <w:pPr/>
-      <w:r>
-        <w:rPr>
-          <w:rFonts w:ascii="Helvetica Light" w:hAnsi="Helvetica Light" w:cs="Helvetica Light"/>
-          <w:sz w:val="24"/>
-          <w:sz-cs w:val="24"/>
+      <w:pPr>
+        <w:spacing w:before="120" w:after="40"/>
+      </w:pPr>
+      <w:r>
+        <w:rPr>
+          <w:rFonts w:ascii="Helvetica Light" w:hAnsi="Helvetica Light" w:cs="Helvetica Light"/>
+          <w:b/>
+          <w:sz w:val="22"/>
+          <w:szCs w:val="22"/>
         </w:rPr>
         <w:t xml:space="preserve">University of Washington — B.S. Computer Science, 2021</w:t>
       </w:r>
     </w:p>
-    <w:sectPr/>
+    <w:p>
+      <w:pPr>
+        <w:spacing w:before="0" w:after="40"/>
+        <w:ind w:left="360"/>
+      </w:pPr>
+      <w:r>
+        <w:rPr>
+          <w:rFonts w:ascii="Helvetica Light" w:hAnsi="Helvetica Light" w:cs="Helvetica Light"/>
+          <w:sz w:val="22"/>
+          <w:szCs w:val="22"/>
+        </w:rPr>
+        <w:t xml:space="preserve">• GPA 3.7. Coursework: distributed systems, machine learning, embedded systems, control theory.</w:t>
+      </w:r>
+    </w:p>
+    <w:p>
+      <w:pPr>
+        <w:spacing w:before="0" w:after="40"/>
+      </w:pPr>
+      <w:r>
+        <w:rPr>
+          <w:rFonts w:ascii="Helvetica Light" w:hAnsi="Helvetica Light" w:cs="Helvetica Light"/>
+          <w:sz w:val="22"/>
+          <w:szCs w:val="22"/>
+        </w:rPr>
+        <w:t xml:space="preserve"/>
+      </w:r>
+    </w:p>
+    <w:p>
+      <w:pPr>
+        <w:spacing w:before="240" w:after="40"/>
+      </w:pPr>
+      <w:r>
+        <w:rPr>
+          <w:rFonts w:ascii="Helvetica Light" w:hAnsi="Helvetica Light" w:cs="Helvetica Light"/>
+          <w:b/>
+          <w:sz w:val="22"/>
+          <w:szCs w:val="22"/>
+        </w:rPr>
+        <w:t xml:space="preserve">PROJECTS</w:t>
+      </w:r>
+    </w:p>
+    <w:p>
+      <w:pPr>
+        <w:spacing w:before="120" w:after="40"/>
+      </w:pPr>
+      <w:r>
+        <w:rPr>
+          <w:rFonts w:ascii="Helvetica Light" w:hAnsi="Helvetica Light" w:cs="Helvetica Light"/>
+          <w:b/>
+          <w:sz w:val="22"/>
+          <w:szCs w:val="22"/>
+        </w:rPr>
+        <w:t xml:space="preserve">UW student rocketry team — Avionics lead (2019 – 2021)</w:t>
+      </w:r>
+    </w:p>
+    <w:p>
+      <w:pPr>
+        <w:spacing w:before="0" w:after="40"/>
+        <w:ind w:left="360"/>
+      </w:pPr>
+      <w:r>
+        <w:rPr>
+          <w:rFonts w:ascii="Helvetica Light" w:hAnsi="Helvetica Light" w:cs="Helvetica Light"/>
+          <w:sz w:val="22"/>
+          <w:szCs w:val="22"/>
+        </w:rPr>
+        <w:t xml:space="preserve">• Wrote the flight computer firmware (C++) for a 30,000 ft hybrid rocket: sensor fusion, apogee detection, parachute deployment, and a 900 MHz telemetry downlink.</w:t>
+      </w:r>
+    </w:p>
+    <w:p>
+      <w:pPr>
+        <w:spacing w:before="0" w:after="40"/>
+        <w:ind w:left="360"/>
+      </w:pPr>
+      <w:r>
+        <w:rPr>
+          <w:rFonts w:ascii="Helvetica Light" w:hAnsi="Helvetica Light" w:cs="Helvetica Light"/>
+          <w:sz w:val="22"/>
+          <w:szCs w:val="22"/>
+        </w:rPr>
+        <w:t xml:space="preserve">• Our first launch lost telemetry at 18,000 ft. I traced it to the antenna detuning inside the carbon fiber airframe and moved it to a fiberglass section; the next flight kept link to apogee.</w:t>
+      </w:r>
+    </w:p>
+    <w:p>
+      <w:pPr>
+        <w:spacing w:before="0" w:after="40"/>
+      </w:pPr>
+      <w:r>
+        <w:rPr>
+          <w:rFonts w:ascii="Helvetica Light" w:hAnsi="Helvetica Light" w:cs="Helvetica Light"/>
+          <w:sz w:val="22"/>
+          <w:szCs w:val="22"/>
+        </w:rPr>
+        <w:t xml:space="preserve"/>
+      </w:r>
+    </w:p>
+    <w:p>
+      <w:pPr>
+        <w:spacing w:before="240" w:after="40"/>
+      </w:pPr>
+      <w:r>
+        <w:rPr>
+          <w:rFonts w:ascii="Helvetica Light" w:hAnsi="Helvetica Light" w:cs="Helvetica Light"/>
+          <w:b/>
+          <w:sz w:val="22"/>
+          <w:szCs w:val="22"/>
+        </w:rPr>
+        <w:t xml:space="preserve">SKILLS</w:t>
+      </w:r>
+    </w:p>
+    <w:p>
+      <w:pPr>
+        <w:spacing w:before="0" w:after="40"/>
+      </w:pPr>
+      <w:r>
+        <w:rPr>
+          <w:rFonts w:ascii="Helvetica Light" w:hAnsi="Helvetica Light" w:cs="Helvetica Light"/>
+          <w:sz w:val="22"/>
+          <w:szCs w:val="22"/>
+        </w:rPr>
+        <w:t xml:space="preserve">Rust, TypeScript, Python, C++, Kafka, PostgreSQL, Kubernetes, PyTorch, embedded Linux</w:t>
+      </w:r>
+    </w:p>
+    <w:p>
+      <w:pPr>
+        <w:spacing w:before="0" w:after="40"/>
+      </w:pPr>
+      <w:r>
+        <w:rPr>
+          <w:rFonts w:ascii="Helvetica Light" w:hAnsi="Helvetica Light" w:cs="Helvetica Light"/>
+          <w:sz w:val="22"/>
+          <w:szCs w:val="22"/>
+        </w:rPr>
+        <w:t xml:space="preserve"/>
+      </w:r>
+    </w:p>
+    <w:p>
+      <w:pPr>
+        <w:spacing w:before="240" w:after="40"/>
+      </w:pPr>
+      <w:r>
+        <w:rPr>
+          <w:rFonts w:ascii="Helvetica Light" w:hAnsi="Helvetica Light" w:cs="Helvetica Light"/>
+          <w:b/>
+          <w:sz w:val="22"/>
+          <w:szCs w:val="22"/>
+        </w:rPr>
+        <w:t xml:space="preserve">INTERESTS</w:t>
+      </w:r>
+    </w:p>
+    <w:p>
+      <w:pPr>
+        <w:spacing w:before="0" w:after="40"/>
+      </w:pPr>
+      <w:r>
+        <w:rPr>
+          <w:rFonts w:ascii="Helvetica Light" w:hAnsi="Helvetica Light" w:cs="Helvetica Light"/>
+          <w:sz w:val="22"/>
+          <w:szCs w:val="22"/>
+        </w:rPr>
+        <w:t xml:space="preserve">High-power rocketry (NAR Level 2 certified), trail running</w:t>
+      </w:r>
+    </w:p>
+    <w:sectPr>
+      <w:pgSz w:w="12240" w:h="15840"/>
+      <w:pgMar w:top="1080" w:right="1080" w:bottom="1080" w:left="1080" w:header="720" w:footer="720" w:gutter="0"/>
+    </w:sectPr>
   </w:body>
 </w:document>
 </file>

</xml_diff>